<commit_message>
update dan perbaikan alur
update dan perbaikan alur
</commit_message>
<xml_diff>
--- a/temp/skl_1002.docx
+++ b/temp/skl_1002.docx
@@ -1574,19 +1574,8 @@
                 <w:sz w:val="20"/>
                 <w:szCs w:val="22"/>
               </w:rPr>
-              <w:t xml:space="preserve">No. </w:t>
-            </w:r>
-            <w:r>
-              <w:rPr>
-                <w:rFonts w:hint="default" w:ascii="Bookman Old Style" w:hAnsi="Bookman Old Style"/>
-                <w:sz w:val="20"/>
-                <w:szCs w:val="22"/>
-                <w:lang w:val="en-US"/>
-              </w:rPr>
-              <w:t>NIS</w:t>
-            </w:r>
-            <w:bookmarkStart w:id="0" w:name="_GoBack"/>
-            <w:bookmarkEnd w:id="0"/>
+              <w:t xml:space="preserve">No. Ujian </w:t>
+            </w:r>
             <w:r>
               <w:rPr>
                 <w:rFonts w:ascii="Bookman Old Style" w:hAnsi="Bookman Old Style"/>
@@ -1616,7 +1605,7 @@
               <w:rPr>
                 <w:rFonts w:hint="default"/>
               </w:rPr>
-              <w:t>1002</w:t>
+              <w:t>0010202503</w:t>
             </w:r>
           </w:p>
           <w:p>
@@ -1677,23 +1666,24 @@
             </w:pPr>
             <w:r>
               <w:rPr>
-                <w:rFonts w:ascii="Bookman Old Style" w:hAnsi="Bookman Old Style"/>
-                <w:b/>
-                <w:sz w:val="30"/>
-                <w:szCs w:val="32"/>
-              </w:rPr>
-              <w:t xml:space="preserve">LULUS / </w:t>
-            </w:r>
-            <w:r>
-              <w:rPr>
-                <w:rFonts w:ascii="Bookman Old Style" w:hAnsi="Bookman Old Style"/>
-                <w:b/>
-                <w:strike/>
-                <w:sz w:val="30"/>
-                <w:szCs w:val="32"/>
-              </w:rPr>
-              <w:t>TIDAK LULUS</w:t>
-            </w:r>
+                <w:b w:val="1"/>
+                <w:bCs w:val="1"/>
+              </w:rPr>
+              <w:t xml:space="preserve">LULUS</w:t>
+            </w:r>
+            <w:r>
+              <w:rPr/>
+              <w:t xml:space="preserve"> / </w:t>
+            </w:r>
+            <w:r>
+              <w:rPr>
+                <w:color w:val="888888"/>
+                <w:strike w:val="1"/>
+              </w:rPr>
+              <w:t xml:space="preserve">TIDAK LULUS</w:t>
+            </w:r>
+            <w:bookmarkStart w:id="0" w:name="_GoBack"/>
+            <w:bookmarkEnd w:id="0"/>
           </w:p>
           <w:p>
             <w:pPr>
@@ -2724,8 +2714,8 @@
     <w:lsdException w:uiPriority="99" w:name="Table Web 1"/>
     <w:lsdException w:uiPriority="99" w:name="Table Web 2"/>
     <w:lsdException w:uiPriority="99" w:name="Table Web 3"/>
-    <w:lsdException w:qFormat="1" w:uiPriority="99" w:name="Balloon Text"/>
-    <w:lsdException w:qFormat="1" w:unhideWhenUsed="0" w:uiPriority="59" w:semiHidden="0" w:name="Table Grid"/>
+    <w:lsdException w:uiPriority="99" w:name="Balloon Text"/>
+    <w:lsdException w:unhideWhenUsed="0" w:uiPriority="59" w:semiHidden="0" w:name="Table Grid"/>
     <w:lsdException w:uiPriority="99" w:name="Table Theme"/>
     <w:lsdException w:unhideWhenUsed="0" w:uiPriority="60" w:semiHidden="0" w:name="Light Shading"/>
     <w:lsdException w:unhideWhenUsed="0" w:uiPriority="61" w:semiHidden="0" w:name="Light List"/>
@@ -2869,7 +2859,6 @@
     <w:link w:val="7"/>
     <w:semiHidden/>
     <w:unhideWhenUsed/>
-    <w:qFormat/>
     <w:uiPriority w:val="99"/>
     <w:rPr>
       <w:rFonts w:ascii="Segoe UI" w:hAnsi="Segoe UI" w:cs="Segoe UI"/>
@@ -2880,7 +2869,6 @@
   <w:style w:type="table" w:styleId="5">
     <w:name w:val="Table Grid"/>
     <w:basedOn w:val="3"/>
-    <w:qFormat/>
     <w:uiPriority w:val="59"/>
     <w:pPr>
       <w:spacing w:after="0" w:line="240" w:lineRule="auto"/>
@@ -2926,6 +2914,7 @@
     <w:basedOn w:val="2"/>
     <w:link w:val="4"/>
     <w:semiHidden/>
+    <w:qFormat/>
     <w:uiPriority w:val="99"/>
     <w:rPr>
       <w:rFonts w:ascii="Segoe UI" w:hAnsi="Segoe UI" w:eastAsia="Times New Roman" w:cs="Segoe UI"/>
@@ -2937,7 +2926,6 @@
   <w:style w:type="paragraph" w:customStyle="1" w:styleId="8">
     <w:name w:val="xl25"/>
     <w:basedOn w:val="1"/>
-    <w:qFormat/>
     <w:uiPriority w:val="0"/>
     <w:pPr>
       <w:widowControl/>

</xml_diff>